<commit_message>
fix: sesuaikan jabatan BAST PPL/PML, batas penyerahan H+5 SPK, dan sync template docx
</commit_message>
<xml_diff>
--- a/TEMPLATE_SPK_BAST/TEMPLATE_BAST_PPL-PML (organik).docx
+++ b/TEMPLATE_SPK_BAST/TEMPLATE_BAST_PPL-PML (organik).docx
@@ -1,6 +1,6 @@
 
 <file path=word/document.xml><?xml version="1.0" encoding="utf-8"?>
-<w:document xmlns:wpc="http://schemas.microsoft.com/office/word/2010/wordprocessingCanvas" xmlns:cx="http://schemas.microsoft.com/office/drawing/2014/chartex" xmlns:cx1="http://schemas.microsoft.com/office/drawing/2015/9/8/chartex" xmlns:cx2="http://schemas.microsoft.com/office/drawing/2015/10/21/chartex" xmlns:cx3="http://schemas.microsoft.com/office/drawing/2016/5/9/chartex" xmlns:cx4="http://schemas.microsoft.com/office/drawing/2016/5/10/chartex" xmlns:cx5="http://schemas.microsoft.com/office/drawing/2016/5/11/chartex" xmlns:cx6="http://schemas.microsoft.com/office/drawing/2016/5/12/chartex" xmlns:cx7="http://schemas.microsoft.com/office/drawing/2016/5/13/chartex" xmlns:cx8="http://schemas.microsoft.com/office/drawing/2016/5/14/chartex" xmlns:mc="http://schemas.openxmlformats.org/markup-compatibility/2006" xmlns:aink="http://schemas.microsoft.com/office/drawing/2016/ink" xmlns:am3d="http://schemas.microsoft.com/office/drawing/2017/model3d" xmlns:o="urn:schemas-microsoft-com:office:office" xmlns:oel="http://schemas.microsoft.com/office/2019/extlst" xmlns:r="http://schemas.openxmlformats.org/officeDocument/2006/relationships" xmlns:m="http://schemas.openxmlformats.org/officeDocument/2006/math" xmlns:v="urn:schemas-microsoft-com:vml" xmlns:wp14="http://schemas.microsoft.com/office/word/2010/wordprocessingDrawing" xmlns:wp="http://schemas.openxmlformats.org/drawingml/2006/wordprocessingDrawing" xmlns:w10="urn:schemas-microsoft-com:office:word" xmlns:w="http://schemas.openxmlformats.org/wordprocessingml/2006/main" xmlns:w14="http://schemas.microsoft.com/office/word/2010/wordml" xmlns:w15="http://schemas.microsoft.com/office/word/2012/wordml" xmlns:w16cei="http://schemas.microsoft.com/office/word/2026/wordml/cei" xmlns:w16cex="http://schemas.microsoft.com/office/word/2018/wordml/cex" xmlns:w16cid="http://schemas.microsoft.com/office/word/2016/wordml/cid" xmlns:w16="http://schemas.microsoft.com/office/word/2018/wordml" xmlns:w16du="http://schemas.microsoft.com/office/word/2023/wordml/word16du" xmlns:w16sdtdh="http://schemas.microsoft.com/office/word/2020/wordml/sdtdatahash" xmlns:w16sdtfl="http://schemas.microsoft.com/office/word/2024/wordml/sdtformatlock" xmlns:w16se="http://schemas.microsoft.com/office/word/2015/wordml/symex" xmlns:wpg="http://schemas.microsoft.com/office/word/2010/wordprocessingGroup" xmlns:wpi="http://schemas.microsoft.com/office/word/2010/wordprocessingInk" xmlns:wne="http://schemas.microsoft.com/office/word/2006/wordml" xmlns:wps="http://schemas.microsoft.com/office/word/2010/wordprocessingShape" mc:Ignorable="w14 w15 w16se w16cid w16 w16cex w16sdtdh w16sdtfl w16du wp14">
+<w:document xmlns:wpc="http://schemas.microsoft.com/office/word/2010/wordprocessingCanvas" xmlns:cx="http://schemas.microsoft.com/office/drawing/2014/chartex" xmlns:cx1="http://schemas.microsoft.com/office/drawing/2015/9/8/chartex" xmlns:cx2="http://schemas.microsoft.com/office/drawing/2015/10/21/chartex" xmlns:cx3="http://schemas.microsoft.com/office/drawing/2016/5/9/chartex" xmlns:cx4="http://schemas.microsoft.com/office/drawing/2016/5/10/chartex" xmlns:cx5="http://schemas.microsoft.com/office/drawing/2016/5/11/chartex" xmlns:cx6="http://schemas.microsoft.com/office/drawing/2016/5/12/chartex" xmlns:cx7="http://schemas.microsoft.com/office/drawing/2016/5/13/chartex" xmlns:cx8="http://schemas.microsoft.com/office/drawing/2016/5/14/chartex" xmlns:mc="http://schemas.openxmlformats.org/markup-compatibility/2006" xmlns:aink="http://schemas.microsoft.com/office/drawing/2016/ink" xmlns:am3d="http://schemas.microsoft.com/office/drawing/2017/model3d" xmlns:o="urn:schemas-microsoft-com:office:office" xmlns:oel="http://schemas.microsoft.com/office/2019/extlst" xmlns:r="http://schemas.openxmlformats.org/officeDocument/2006/relationships" xmlns:m="http://schemas.openxmlformats.org/officeDocument/2006/math" xmlns:v="urn:schemas-microsoft-com:vml" xmlns:wp14="http://schemas.microsoft.com/office/word/2010/wordprocessingDrawing" xmlns:wp="http://schemas.openxmlformats.org/drawingml/2006/wordprocessingDrawing" xmlns:w10="urn:schemas-microsoft-com:office:word" xmlns:w="http://schemas.openxmlformats.org/wordprocessingml/2006/main" xmlns:w14="http://schemas.microsoft.com/office/word/2010/wordml" xmlns:w15="http://schemas.microsoft.com/office/word/2012/wordml" xmlns:w16cex="http://schemas.microsoft.com/office/word/2018/wordml/cex" xmlns:w16cid="http://schemas.microsoft.com/office/word/2016/wordml/cid" xmlns:w16="http://schemas.microsoft.com/office/word/2018/wordml" xmlns:w16du="http://schemas.microsoft.com/office/word/2023/wordml/word16du" xmlns:w16sdtdh="http://schemas.microsoft.com/office/word/2020/wordml/sdtdatahash" xmlns:w16sdtfl="http://schemas.microsoft.com/office/word/2024/wordml/sdtformatlock" xmlns:w16se="http://schemas.microsoft.com/office/word/2015/wordml/symex" xmlns:wpg="http://schemas.microsoft.com/office/word/2010/wordprocessingGroup" xmlns:wpi="http://schemas.microsoft.com/office/word/2010/wordprocessingInk" xmlns:wne="http://schemas.microsoft.com/office/word/2006/wordml" xmlns:wps="http://schemas.microsoft.com/office/word/2010/wordprocessingShape" mc:Ignorable="w14 w15 w16se w16cid w16 w16cex w16sdtdh w16sdtfl w16du wp14">
   <w:body>
     <w:p>
       <w:pPr>
@@ -246,7 +246,6 @@
         </w:rPr>
         <w:t xml:space="preserve"> bertempat di Kota </w:t>
       </w:r>
-      <w:proofErr w:type="spellStart"/>
       <w:r>
         <w:rPr>
           <w:rFonts w:ascii="Arial" w:hAnsi="Arial" w:cs="Arial"/>
@@ -254,7 +253,6 @@
         </w:rPr>
         <w:t>Subulussalam</w:t>
       </w:r>
-      <w:proofErr w:type="spellEnd"/>
       <w:r>
         <w:rPr>
           <w:rFonts w:ascii="Arial" w:hAnsi="Arial" w:cs="Arial"/>
@@ -436,133 +434,12 @@
           <w:lang w:val="en-US"/>
         </w:rPr>
       </w:pPr>
-      <w:proofErr w:type="spellStart"/>
-      <w:r>
-        <w:rPr>
-          <w:rFonts w:ascii="Arial" w:hAnsi="Arial" w:cs="Arial"/>
-          <w:lang w:val="en-US"/>
-        </w:rPr>
-        <w:t>bertindak</w:t>
-      </w:r>
-      <w:proofErr w:type="spellEnd"/>
-      <w:r>
-        <w:rPr>
-          <w:rFonts w:ascii="Arial" w:hAnsi="Arial" w:cs="Arial"/>
-          <w:lang w:val="en-US"/>
-        </w:rPr>
-        <w:t xml:space="preserve"> </w:t>
-      </w:r>
-      <w:proofErr w:type="spellStart"/>
-      <w:r>
-        <w:rPr>
-          <w:rFonts w:ascii="Arial" w:hAnsi="Arial" w:cs="Arial"/>
-          <w:lang w:val="en-US"/>
-        </w:rPr>
-        <w:t>untuk</w:t>
-      </w:r>
-      <w:proofErr w:type="spellEnd"/>
-      <w:r>
-        <w:rPr>
-          <w:rFonts w:ascii="Arial" w:hAnsi="Arial" w:cs="Arial"/>
-          <w:lang w:val="en-US"/>
-        </w:rPr>
-        <w:t xml:space="preserve"> dan </w:t>
-      </w:r>
-      <w:proofErr w:type="spellStart"/>
-      <w:r>
-        <w:rPr>
-          <w:rFonts w:ascii="Arial" w:hAnsi="Arial" w:cs="Arial"/>
-          <w:lang w:val="en-US"/>
-        </w:rPr>
-        <w:t>atas</w:t>
-      </w:r>
-      <w:proofErr w:type="spellEnd"/>
-      <w:r>
-        <w:rPr>
-          <w:rFonts w:ascii="Arial" w:hAnsi="Arial" w:cs="Arial"/>
-          <w:lang w:val="en-US"/>
-        </w:rPr>
-        <w:t xml:space="preserve"> </w:t>
-      </w:r>
-      <w:proofErr w:type="spellStart"/>
-      <w:r>
-        <w:rPr>
-          <w:rFonts w:ascii="Arial" w:hAnsi="Arial" w:cs="Arial"/>
-          <w:lang w:val="en-US"/>
-        </w:rPr>
-        <w:t>namanya</w:t>
-      </w:r>
-      <w:proofErr w:type="spellEnd"/>
-      <w:r>
-        <w:rPr>
-          <w:rFonts w:ascii="Arial" w:hAnsi="Arial" w:cs="Arial"/>
-          <w:lang w:val="en-US"/>
-        </w:rPr>
-        <w:t xml:space="preserve"> </w:t>
-      </w:r>
-      <w:proofErr w:type="spellStart"/>
-      <w:r>
-        <w:rPr>
-          <w:rFonts w:ascii="Arial" w:hAnsi="Arial" w:cs="Arial"/>
-          <w:lang w:val="en-US"/>
-        </w:rPr>
-        <w:t>sendiri</w:t>
-      </w:r>
-      <w:proofErr w:type="spellEnd"/>
-      <w:r>
-        <w:rPr>
-          <w:rFonts w:ascii="Arial" w:hAnsi="Arial" w:cs="Arial"/>
-          <w:lang w:val="en-US"/>
-        </w:rPr>
-        <w:t xml:space="preserve">, </w:t>
-      </w:r>
-      <w:proofErr w:type="spellStart"/>
-      <w:r>
-        <w:rPr>
-          <w:rFonts w:ascii="Arial" w:hAnsi="Arial" w:cs="Arial"/>
-          <w:lang w:val="en-US"/>
-        </w:rPr>
-        <w:t>selanjutnya</w:t>
-      </w:r>
-      <w:proofErr w:type="spellEnd"/>
-      <w:r>
-        <w:rPr>
-          <w:rFonts w:ascii="Arial" w:hAnsi="Arial" w:cs="Arial"/>
-          <w:lang w:val="en-US"/>
-        </w:rPr>
-        <w:t xml:space="preserve"> </w:t>
-      </w:r>
-      <w:proofErr w:type="spellStart"/>
-      <w:r>
-        <w:rPr>
-          <w:rFonts w:ascii="Arial" w:hAnsi="Arial" w:cs="Arial"/>
-          <w:lang w:val="en-US"/>
-        </w:rPr>
-        <w:t>disebut</w:t>
-      </w:r>
-      <w:proofErr w:type="spellEnd"/>
-      <w:r>
-        <w:rPr>
-          <w:rFonts w:ascii="Arial" w:hAnsi="Arial" w:cs="Arial"/>
-          <w:lang w:val="en-US"/>
-        </w:rPr>
-        <w:t xml:space="preserve"> </w:t>
-      </w:r>
-      <w:proofErr w:type="spellStart"/>
-      <w:r>
-        <w:rPr>
-          <w:rFonts w:ascii="Arial" w:hAnsi="Arial" w:cs="Arial"/>
-          <w:lang w:val="en-US"/>
-        </w:rPr>
-        <w:t>sebagai</w:t>
-      </w:r>
-      <w:proofErr w:type="spellEnd"/>
-      <w:r>
-        <w:rPr>
-          <w:rFonts w:ascii="Arial" w:hAnsi="Arial" w:cs="Arial"/>
-          <w:lang w:val="en-US"/>
-        </w:rPr>
-        <w:t xml:space="preserve"> PIHAK PERTAMA.</w:t>
+      <w:r>
+        <w:rPr>
+          <w:rFonts w:ascii="Arial" w:hAnsi="Arial" w:cs="Arial"/>
+          <w:lang w:val="en-US"/>
+        </w:rPr>
+        <w:t>bertindak untuk dan atas namanya sendiri, selanjutnya disebut sebagai PIHAK PERTAMA.</w:t>
       </w:r>
     </w:p>
     <w:p>
@@ -624,7 +501,14 @@
           <w:rFonts w:ascii="Arial" w:hAnsi="Arial" w:cs="Arial"/>
           <w:lang w:val="en-US"/>
         </w:rPr>
-        <w:t>NIK</w:t>
+        <w:t>NI</w:t>
+      </w:r>
+      <w:r>
+        <w:rPr>
+          <w:rFonts w:ascii="Arial" w:hAnsi="Arial" w:cs="Arial"/>
+          <w:lang w:val="en-US"/>
+        </w:rPr>
+        <w:t>P</w:t>
       </w:r>
       <w:r>
         <w:rPr>
@@ -717,34 +601,16 @@
           <w:rFonts w:ascii="Arial" w:hAnsi="Arial" w:cs="Arial"/>
           <w:lang w:val="en-US"/>
         </w:rPr>
-        <w:t xml:space="preserve">Unit </w:t>
-      </w:r>
-      <w:proofErr w:type="spellStart"/>
-      <w:r>
-        <w:rPr>
-          <w:rFonts w:ascii="Arial" w:hAnsi="Arial" w:cs="Arial"/>
-          <w:lang w:val="en-US"/>
-        </w:rPr>
-        <w:t>Kerja</w:t>
-      </w:r>
-      <w:proofErr w:type="spellEnd"/>
+        <w:t>Unit Kerja</w:t>
+      </w:r>
       <w:r>
         <w:rPr>
           <w:rFonts w:ascii="Arial" w:hAnsi="Arial" w:cs="Arial"/>
           <w:lang w:val="en-US"/>
         </w:rPr>
         <w:tab/>
-        <w:t xml:space="preserve">:  BPS Kota </w:t>
-      </w:r>
-      <w:proofErr w:type="spellStart"/>
-      <w:r>
-        <w:rPr>
-          <w:rFonts w:ascii="Arial" w:hAnsi="Arial" w:cs="Arial"/>
-          <w:lang w:val="en-US"/>
-        </w:rPr>
-        <w:t>Subulussalam</w:t>
-      </w:r>
-      <w:proofErr w:type="spellEnd"/>
+        <w:t>:  BPS Kota Subulussalam</w:t>
+      </w:r>
     </w:p>
     <w:p>
       <w:pPr>
@@ -756,117 +622,12 @@
           <w:lang w:val="en-US"/>
         </w:rPr>
       </w:pPr>
-      <w:proofErr w:type="spellStart"/>
-      <w:r>
-        <w:rPr>
-          <w:rFonts w:ascii="Arial" w:hAnsi="Arial" w:cs="Arial"/>
-          <w:lang w:val="en-US"/>
-        </w:rPr>
-        <w:t>bertindak</w:t>
-      </w:r>
-      <w:proofErr w:type="spellEnd"/>
-      <w:r>
-        <w:rPr>
-          <w:rFonts w:ascii="Arial" w:hAnsi="Arial" w:cs="Arial"/>
-          <w:lang w:val="en-US"/>
-        </w:rPr>
-        <w:t xml:space="preserve"> </w:t>
-      </w:r>
-      <w:proofErr w:type="spellStart"/>
-      <w:r>
-        <w:rPr>
-          <w:rFonts w:ascii="Arial" w:hAnsi="Arial" w:cs="Arial"/>
-          <w:lang w:val="en-US"/>
-        </w:rPr>
-        <w:t>untuk</w:t>
-      </w:r>
-      <w:proofErr w:type="spellEnd"/>
-      <w:r>
-        <w:rPr>
-          <w:rFonts w:ascii="Arial" w:hAnsi="Arial" w:cs="Arial"/>
-          <w:lang w:val="en-US"/>
-        </w:rPr>
-        <w:t xml:space="preserve"> dan </w:t>
-      </w:r>
-      <w:proofErr w:type="spellStart"/>
-      <w:r>
-        <w:rPr>
-          <w:rFonts w:ascii="Arial" w:hAnsi="Arial" w:cs="Arial"/>
-          <w:lang w:val="en-US"/>
-        </w:rPr>
-        <w:t>atas</w:t>
-      </w:r>
-      <w:proofErr w:type="spellEnd"/>
-      <w:r>
-        <w:rPr>
-          <w:rFonts w:ascii="Arial" w:hAnsi="Arial" w:cs="Arial"/>
-          <w:lang w:val="en-US"/>
-        </w:rPr>
-        <w:t xml:space="preserve"> nama BPS Kota </w:t>
-      </w:r>
-      <w:proofErr w:type="spellStart"/>
-      <w:r>
-        <w:rPr>
-          <w:rFonts w:ascii="Arial" w:hAnsi="Arial" w:cs="Arial"/>
-          <w:lang w:val="en-US"/>
-        </w:rPr>
-        <w:t>Subulussalam</w:t>
-      </w:r>
-      <w:proofErr w:type="spellEnd"/>
-      <w:r>
-        <w:rPr>
-          <w:rFonts w:ascii="Arial" w:hAnsi="Arial" w:cs="Arial"/>
-          <w:lang w:val="en-US"/>
-        </w:rPr>
-        <w:t xml:space="preserve">, </w:t>
-      </w:r>
-      <w:proofErr w:type="spellStart"/>
-      <w:r>
-        <w:rPr>
-          <w:rFonts w:ascii="Arial" w:hAnsi="Arial" w:cs="Arial"/>
-          <w:lang w:val="en-US"/>
-        </w:rPr>
-        <w:t>selanjutnya</w:t>
-      </w:r>
-      <w:proofErr w:type="spellEnd"/>
-      <w:r>
-        <w:rPr>
-          <w:rFonts w:ascii="Arial" w:hAnsi="Arial" w:cs="Arial"/>
-          <w:lang w:val="en-US"/>
-        </w:rPr>
-        <w:t xml:space="preserve"> </w:t>
-      </w:r>
-      <w:proofErr w:type="spellStart"/>
-      <w:r>
-        <w:rPr>
-          <w:rFonts w:ascii="Arial" w:hAnsi="Arial" w:cs="Arial"/>
-          <w:lang w:val="en-US"/>
-        </w:rPr>
-        <w:t>disebut</w:t>
-      </w:r>
-      <w:proofErr w:type="spellEnd"/>
-      <w:r>
-        <w:rPr>
-          <w:rFonts w:ascii="Arial" w:hAnsi="Arial" w:cs="Arial"/>
-          <w:lang w:val="en-US"/>
-        </w:rPr>
-        <w:t xml:space="preserve"> </w:t>
-      </w:r>
-      <w:proofErr w:type="spellStart"/>
-      <w:r>
-        <w:rPr>
-          <w:rFonts w:ascii="Arial" w:hAnsi="Arial" w:cs="Arial"/>
-          <w:lang w:val="en-US"/>
-        </w:rPr>
-        <w:t>sebagai</w:t>
-      </w:r>
-      <w:proofErr w:type="spellEnd"/>
-      <w:r>
-        <w:rPr>
-          <w:rFonts w:ascii="Arial" w:hAnsi="Arial" w:cs="Arial"/>
-          <w:lang w:val="en-US"/>
-        </w:rPr>
-        <w:t xml:space="preserve"> PIHAK KEDUA.</w:t>
+      <w:r>
+        <w:rPr>
+          <w:rFonts w:ascii="Arial" w:hAnsi="Arial" w:cs="Arial"/>
+          <w:lang w:val="en-US"/>
+        </w:rPr>
+        <w:t>bertindak untuk dan atas nama BPS Kota Subulussalam, selanjutnya disebut sebagai PIHAK KEDUA.</w:t>
       </w:r>
     </w:p>
     <w:p>
@@ -893,21 +654,12 @@
         </w:rPr>
         <w:t xml:space="preserve">Berdasarkan Surat Keputusan Kepala BPS Kota Subulussalam </w:t>
       </w:r>
-      <w:proofErr w:type="spellStart"/>
-      <w:r>
-        <w:rPr>
-          <w:rFonts w:ascii="Arial" w:hAnsi="Arial" w:cs="Arial"/>
-          <w:lang w:val="en-US"/>
-        </w:rPr>
-        <w:t>Nomor</w:t>
-      </w:r>
-      <w:proofErr w:type="spellEnd"/>
-      <w:r>
-        <w:rPr>
-          <w:rFonts w:ascii="Arial" w:hAnsi="Arial" w:cs="Arial"/>
-          <w:lang w:val="en-US"/>
-        </w:rPr>
-        <w:t xml:space="preserve"> </w:t>
+      <w:r>
+        <w:rPr>
+          <w:rFonts w:ascii="Arial" w:hAnsi="Arial" w:cs="Arial"/>
+          <w:lang w:val="en-US"/>
+        </w:rPr>
+        <w:t xml:space="preserve">Nomor </w:t>
       </w:r>
       <w:r>
         <w:rPr>
@@ -1414,7 +1166,7 @@
 </file>
 
 <file path=word/numbering.xml><?xml version="1.0" encoding="utf-8"?>
-<w:numbering xmlns:wpc="http://schemas.microsoft.com/office/word/2010/wordprocessingCanvas" xmlns:cx="http://schemas.microsoft.com/office/drawing/2014/chartex" xmlns:cx1="http://schemas.microsoft.com/office/drawing/2015/9/8/chartex" xmlns:cx2="http://schemas.microsoft.com/office/drawing/2015/10/21/chartex" xmlns:cx3="http://schemas.microsoft.com/office/drawing/2016/5/9/chartex" xmlns:cx4="http://schemas.microsoft.com/office/drawing/2016/5/10/chartex" xmlns:cx5="http://schemas.microsoft.com/office/drawing/2016/5/11/chartex" xmlns:cx6="http://schemas.microsoft.com/office/drawing/2016/5/12/chartex" xmlns:cx7="http://schemas.microsoft.com/office/drawing/2016/5/13/chartex" xmlns:cx8="http://schemas.microsoft.com/office/drawing/2016/5/14/chartex" xmlns:mc="http://schemas.openxmlformats.org/markup-compatibility/2006" xmlns:aink="http://schemas.microsoft.com/office/drawing/2016/ink" xmlns:am3d="http://schemas.microsoft.com/office/drawing/2017/model3d" xmlns:o="urn:schemas-microsoft-com:office:office" xmlns:oel="http://schemas.microsoft.com/office/2019/extlst" xmlns:r="http://schemas.openxmlformats.org/officeDocument/2006/relationships" xmlns:m="http://schemas.openxmlformats.org/officeDocument/2006/math" xmlns:v="urn:schemas-microsoft-com:vml" xmlns:wp14="http://schemas.microsoft.com/office/word/2010/wordprocessingDrawing" xmlns:wp="http://schemas.openxmlformats.org/drawingml/2006/wordprocessingDrawing" xmlns:w10="urn:schemas-microsoft-com:office:word" xmlns:w="http://schemas.openxmlformats.org/wordprocessingml/2006/main" xmlns:w14="http://schemas.microsoft.com/office/word/2010/wordml" xmlns:w15="http://schemas.microsoft.com/office/word/2012/wordml" xmlns:w16cei="http://schemas.microsoft.com/office/word/2026/wordml/cei" xmlns:w16cex="http://schemas.microsoft.com/office/word/2018/wordml/cex" xmlns:w16cid="http://schemas.microsoft.com/office/word/2016/wordml/cid" xmlns:w16="http://schemas.microsoft.com/office/word/2018/wordml" xmlns:w16du="http://schemas.microsoft.com/office/word/2023/wordml/word16du" xmlns:w16sdtdh="http://schemas.microsoft.com/office/word/2020/wordml/sdtdatahash" xmlns:w16sdtfl="http://schemas.microsoft.com/office/word/2024/wordml/sdtformatlock" xmlns:w16se="http://schemas.microsoft.com/office/word/2015/wordml/symex" xmlns:wpg="http://schemas.microsoft.com/office/word/2010/wordprocessingGroup" xmlns:wpi="http://schemas.microsoft.com/office/word/2010/wordprocessingInk" xmlns:wne="http://schemas.microsoft.com/office/word/2006/wordml" xmlns:wps="http://schemas.microsoft.com/office/word/2010/wordprocessingShape" mc:Ignorable="w14 w15 w16se w16cid w16 w16cex w16sdtdh w16sdtfl w16du wp14">
+<w:numbering xmlns:wpc="http://schemas.microsoft.com/office/word/2010/wordprocessingCanvas" xmlns:cx="http://schemas.microsoft.com/office/drawing/2014/chartex" xmlns:cx1="http://schemas.microsoft.com/office/drawing/2015/9/8/chartex" xmlns:cx2="http://schemas.microsoft.com/office/drawing/2015/10/21/chartex" xmlns:cx3="http://schemas.microsoft.com/office/drawing/2016/5/9/chartex" xmlns:cx4="http://schemas.microsoft.com/office/drawing/2016/5/10/chartex" xmlns:cx5="http://schemas.microsoft.com/office/drawing/2016/5/11/chartex" xmlns:cx6="http://schemas.microsoft.com/office/drawing/2016/5/12/chartex" xmlns:cx7="http://schemas.microsoft.com/office/drawing/2016/5/13/chartex" xmlns:cx8="http://schemas.microsoft.com/office/drawing/2016/5/14/chartex" xmlns:mc="http://schemas.openxmlformats.org/markup-compatibility/2006" xmlns:aink="http://schemas.microsoft.com/office/drawing/2016/ink" xmlns:am3d="http://schemas.microsoft.com/office/drawing/2017/model3d" xmlns:o="urn:schemas-microsoft-com:office:office" xmlns:oel="http://schemas.microsoft.com/office/2019/extlst" xmlns:r="http://schemas.openxmlformats.org/officeDocument/2006/relationships" xmlns:m="http://schemas.openxmlformats.org/officeDocument/2006/math" xmlns:v="urn:schemas-microsoft-com:vml" xmlns:wp14="http://schemas.microsoft.com/office/word/2010/wordprocessingDrawing" xmlns:wp="http://schemas.openxmlformats.org/drawingml/2006/wordprocessingDrawing" xmlns:w10="urn:schemas-microsoft-com:office:word" xmlns:w="http://schemas.openxmlformats.org/wordprocessingml/2006/main" xmlns:w14="http://schemas.microsoft.com/office/word/2010/wordml" xmlns:w15="http://schemas.microsoft.com/office/word/2012/wordml" xmlns:w16cex="http://schemas.microsoft.com/office/word/2018/wordml/cex" xmlns:w16cid="http://schemas.microsoft.com/office/word/2016/wordml/cid" xmlns:w16="http://schemas.microsoft.com/office/word/2018/wordml" xmlns:w16du="http://schemas.microsoft.com/office/word/2023/wordml/word16du" xmlns:w16sdtdh="http://schemas.microsoft.com/office/word/2020/wordml/sdtdatahash" xmlns:w16sdtfl="http://schemas.microsoft.com/office/word/2024/wordml/sdtformatlock" xmlns:w16se="http://schemas.microsoft.com/office/word/2015/wordml/symex" xmlns:wpg="http://schemas.microsoft.com/office/word/2010/wordprocessingGroup" xmlns:wpi="http://schemas.microsoft.com/office/word/2010/wordprocessingInk" xmlns:wne="http://schemas.microsoft.com/office/word/2006/wordml" xmlns:wps="http://schemas.microsoft.com/office/word/2010/wordprocessingShape" mc:Ignorable="w14 w15 w16se w16cid w16 w16cex w16sdtdh w16sdtfl w16du wp14">
   <w:abstractNum w:abstractNumId="0" w15:restartNumberingAfterBreak="1">
     <w:nsid w:val="2861459E"/>
     <w:multiLevelType w:val="hybridMultilevel"/>

</xml_diff>